<commit_message>
Fix study document layout issues
</commit_message>
<xml_diff>
--- a/estudo/Simulado_Final_Metodologia.docx
+++ b/estudo/Simulado_Final_Metodologia.docx
@@ -56,17 +56,17 @@
     </w:p>
     <w:p>
       <w:r>
-        <w:t xml:space="preserve">________________________________________________________________________________</w:t>
-      </w:r>
-    </w:p>
-    <w:p>
-      <w:r>
-        <w:t xml:space="preserve">________________________________________________________________________________</w:t>
-      </w:r>
-    </w:p>
-    <w:p>
-      <w:r>
-        <w:t xml:space="preserve">________________________________________________________________________________</w:t>
+        <w:t xml:space="preserve"/>
+      </w:r>
+    </w:p>
+    <w:p>
+      <w:r>
+        <w:t xml:space="preserve"/>
+      </w:r>
+    </w:p>
+    <w:p>
+      <w:r>
+        <w:t xml:space="preserve"/>
       </w:r>
     </w:p>
     <w:p>
@@ -84,17 +84,17 @@
     </w:p>
     <w:p>
       <w:r>
-        <w:t xml:space="preserve">________________________________________________________________________________</w:t>
-      </w:r>
-    </w:p>
-    <w:p>
-      <w:r>
-        <w:t xml:space="preserve">________________________________________________________________________________</w:t>
-      </w:r>
-    </w:p>
-    <w:p>
-      <w:r>
-        <w:t xml:space="preserve">________________________________________________________________________________</w:t>
+        <w:t xml:space="preserve"/>
+      </w:r>
+    </w:p>
+    <w:p>
+      <w:r>
+        <w:t xml:space="preserve"/>
+      </w:r>
+    </w:p>
+    <w:p>
+      <w:r>
+        <w:t xml:space="preserve"/>
       </w:r>
     </w:p>
     <w:p>
@@ -112,17 +112,17 @@
     </w:p>
     <w:p>
       <w:r>
-        <w:t xml:space="preserve">________________________________________________________________________________</w:t>
-      </w:r>
-    </w:p>
-    <w:p>
-      <w:r>
-        <w:t xml:space="preserve">________________________________________________________________________________</w:t>
-      </w:r>
-    </w:p>
-    <w:p>
-      <w:r>
-        <w:t xml:space="preserve">________________________________________________________________________________</w:t>
+        <w:t xml:space="preserve"/>
+      </w:r>
+    </w:p>
+    <w:p>
+      <w:r>
+        <w:t xml:space="preserve"/>
+      </w:r>
+    </w:p>
+    <w:p>
+      <w:r>
+        <w:t xml:space="preserve"/>
       </w:r>
     </w:p>
     <w:p>
@@ -140,17 +140,17 @@
     </w:p>
     <w:p>
       <w:r>
-        <w:t xml:space="preserve">________________________________________________________________________________</w:t>
-      </w:r>
-    </w:p>
-    <w:p>
-      <w:r>
-        <w:t xml:space="preserve">________________________________________________________________________________</w:t>
-      </w:r>
-    </w:p>
-    <w:p>
-      <w:r>
-        <w:t xml:space="preserve">________________________________________________________________________________</w:t>
+        <w:t xml:space="preserve"/>
+      </w:r>
+    </w:p>
+    <w:p>
+      <w:r>
+        <w:t xml:space="preserve"/>
+      </w:r>
+    </w:p>
+    <w:p>
+      <w:r>
+        <w:t xml:space="preserve"/>
       </w:r>
     </w:p>
     <w:p>
@@ -275,18 +275,5 @@
       <w:sz w:val="24"/>
     </w:rPr>
   </w:style>
-  <w:style w:type="table" w:styleId="TableGrid">
-    <w:name w:val="Table Grid"/>
-    <w:tblPr>
-      <w:tblBorders>
-        <w:top w:val="single" w:sz="4"/>
-        <w:left w:val="single" w:sz="4"/>
-        <w:bottom w:val="single" w:sz="4"/>
-        <w:right w:val="single" w:sz="4"/>
-        <w:insideH w:val="single" w:sz="4"/>
-        <w:insideV w:val="single" w:sz="4"/>
-      </w:tblBorders>
-    </w:tblPr>
-  </w:style>
 </w:styles>
 </file>
</xml_diff>